<commit_message>
Group all the products in single table based on price condition.
</commit_message>
<xml_diff>
--- a/srv/tests/Spain_Template_revised.docx
+++ b/srv/tests/Spain_Template_revised.docx
@@ -1454,6 +1454,42 @@
           <w:rFonts w:cstheme="minorHAnsi"/>
           <w:lang w:val="it-IT" w:bidi="ta-IN"/>
         </w:rPr>
+        <w:t>{#</w:t>
+      </w:r>
+      <w:r>
+        <w:rPr>
+          <w:rFonts w:cstheme="minorHAnsi"/>
+          <w:lang w:val="it-IT" w:bidi="ta-IN"/>
+        </w:rPr>
+        <w:t>groupedOfferProductValidation</w:t>
+      </w:r>
+      <w:r>
+        <w:rPr>
+          <w:rFonts w:cstheme="minorHAnsi"/>
+          <w:lang w:val="it-IT" w:bidi="ta-IN"/>
+        </w:rPr>
+        <w:t>}{#</w:t>
+      </w:r>
+      <w:r>
+        <w:rPr>
+          <w:rFonts w:cstheme="minorHAnsi"/>
+          <w:lang w:val="it-IT" w:bidi="ta-IN"/>
+        </w:rPr>
+        <w:t>PVL}</w:t>
+      </w:r>
+    </w:p>
+    <w:p>
+      <w:pPr>
+        <w:rPr>
+          <w:rFonts w:cstheme="minorHAnsi"/>
+          <w:lang w:val="it-IT" w:bidi="ta-IN"/>
+        </w:rPr>
+      </w:pPr>
+      <w:r>
+        <w:rPr>
+          <w:rFonts w:cstheme="minorHAnsi"/>
+          <w:lang w:val="it-IT" w:bidi="ta-IN"/>
+        </w:rPr>
         <w:t>PVL</w:t>
       </w:r>
     </w:p>
@@ -1560,14 +1596,7 @@
                 <w:rFonts w:cstheme="minorHAnsi"/>
                 <w:lang w:bidi="ta-IN"/>
               </w:rPr>
-              <w:t>{#flatOfferProductValidation}{#PriceConditionClassification</w:t>
-            </w:r>
-            <w:r>
-              <w:rPr>
-                <w:rFonts w:cstheme="minorHAnsi"/>
-                <w:lang w:bidi="ta-IN"/>
-              </w:rPr>
-              <w:t>}{#ConditionType==‘PVL’}</w:t>
+              <w:t>{#items}</w:t>
             </w:r>
             <w:r>
               <w:rPr>
@@ -1762,13 +1791,13 @@
               <w:t>}</w:t>
             </w:r>
             <w:r>
-              <w:t>{/}</w:t>
-            </w:r>
-            <w:r>
-              <w:t>{/}</w:t>
-            </w:r>
-            <w:r>
-              <w:t>{/}</w:t>
+              <w:t>{/</w:t>
+            </w:r>
+            <w:r>
+              <w:t>items</w:t>
+            </w:r>
+            <w:r>
+              <w:t>}</w:t>
             </w:r>
           </w:p>
         </w:tc>
@@ -1861,6 +1890,34 @@
           <w:lang w:bidi="ta-IN"/>
         </w:rPr>
       </w:pPr>
+      <w:r>
+        <w:rPr>
+          <w:rFonts w:cstheme="minorHAnsi"/>
+          <w:lang w:bidi="ta-IN"/>
+        </w:rPr>
+        <w:t>{/</w:t>
+      </w:r>
+      <w:r>
+        <w:rPr>
+          <w:rFonts w:cstheme="minorHAnsi"/>
+          <w:lang w:bidi="ta-IN"/>
+        </w:rPr>
+        <w:t>}</w:t>
+      </w:r>
+      <w:r>
+        <w:rPr>
+          <w:rFonts w:cstheme="minorHAnsi"/>
+          <w:lang w:bidi="ta-IN"/>
+        </w:rPr>
+        <w:t>{#</w:t>
+      </w:r>
+      <w:r>
+        <w:rPr>
+          <w:rFonts w:cstheme="minorHAnsi"/>
+          <w:lang w:bidi="ta-IN"/>
+        </w:rPr>
+        <w:t>PrecioNeto}</w:t>
+      </w:r>
     </w:p>
     <w:p>
       <w:pPr>
@@ -1896,11 +1953,11 @@
         <w:tblLook w:val="04A0" w:firstRow="1" w:lastRow="0" w:firstColumn="1" w:lastColumn="0" w:noHBand="0" w:noVBand="1"/>
       </w:tblPr>
       <w:tblGrid>
-        <w:gridCol w:w="3484"/>
-        <w:gridCol w:w="951"/>
-        <w:gridCol w:w="2333"/>
-        <w:gridCol w:w="1121"/>
-        <w:gridCol w:w="2427"/>
+        <w:gridCol w:w="1379"/>
+        <w:gridCol w:w="1206"/>
+        <w:gridCol w:w="3070"/>
+        <w:gridCol w:w="1436"/>
+        <w:gridCol w:w="3225"/>
       </w:tblGrid>
       <w:tr>
         <w:tc>
@@ -2040,32 +2097,14 @@
                 <w:rFonts w:cstheme="minorHAnsi"/>
                 <w:lang w:bidi="ta-IN"/>
               </w:rPr>
-              <w:t>{#flatOfferProductValidation}{#PriceConditionClassification}</w:t>
-            </w:r>
-            <w:r>
-              <w:rPr>
-                <w:rFonts w:cstheme="minorHAnsi"/>
-                <w:lang w:bidi="ta-IN"/>
-              </w:rPr>
               <w:t>{#</w:t>
             </w:r>
             <w:r>
               <w:rPr>
-                <w:lang w:bidi="ta-IN"/>
-              </w:rPr>
-              <w:t>ConditionType==’Precio</w:t>
-            </w:r>
-            <w:r>
-              <w:rPr>
-                <w:lang w:bidi="ta-IN"/>
-              </w:rPr>
-              <w:t xml:space="preserve"> </w:t>
-            </w:r>
-            <w:r>
-              <w:rPr>
-                <w:lang w:bidi="ta-IN"/>
-              </w:rPr>
-              <w:t>Neto’</w:t>
+                <w:rFonts w:cstheme="minorHAnsi"/>
+                <w:lang w:bidi="ta-IN"/>
+              </w:rPr>
+              <w:t>items</w:t>
             </w:r>
             <w:r>
               <w:rPr>
@@ -2334,17 +2373,21 @@
                 <w:rFonts w:cstheme="minorHAnsi"/>
                 <w:lang w:bidi="ta-IN"/>
               </w:rPr>
-              <w:t>{/}</w:t>
-            </w:r>
-            <w:r>
-              <w:rPr>
-                <w:rFonts w:cstheme="minorHAnsi"/>
-                <w:lang w:bidi="ta-IN"/>
-              </w:rPr>
-              <w:t>{/}</w:t>
-            </w:r>
-            <w:r>
-              <w:t>{/}</w:t>
+              <w:t>{/</w:t>
+            </w:r>
+            <w:r>
+              <w:rPr>
+                <w:rFonts w:cstheme="minorHAnsi"/>
+                <w:lang w:bidi="ta-IN"/>
+              </w:rPr>
+              <w:t>items</w:t>
+            </w:r>
+            <w:r>
+              <w:rPr>
+                <w:rFonts w:cstheme="minorHAnsi"/>
+                <w:lang w:bidi="ta-IN"/>
+              </w:rPr>
+              <w:t>}</w:t>
             </w:r>
           </w:p>
         </w:tc>
@@ -2434,9 +2477,28 @@
         <w:jc w:val="both"/>
         <w:rPr>
           <w:rFonts w:cstheme="minorHAnsi"/>
+          <w:b/>
+          <w:bCs/>
           <w:lang w:bidi="ta-IN"/>
         </w:rPr>
       </w:pPr>
+      <w:r>
+        <w:rPr>
+          <w:rFonts w:cstheme="minorHAnsi"/>
+          <w:lang w:bidi="ta-IN"/>
+        </w:rPr>
+        <w:t>{/}{#</w:t>
+      </w:r>
+      <w:r>
+        <w:t>DescuentoComercial</w:t>
+      </w:r>
+      <w:r>
+        <w:rPr>
+          <w:rFonts w:cstheme="minorHAnsi"/>
+          <w:lang w:bidi="ta-IN"/>
+        </w:rPr>
+        <w:t>}</w:t>
+      </w:r>
     </w:p>
     <w:p>
       <w:pPr>
@@ -2551,11 +2613,11 @@
         <w:tblLook w:val="04A0" w:firstRow="1" w:lastRow="0" w:firstColumn="1" w:lastColumn="0" w:noHBand="0" w:noVBand="1"/>
       </w:tblPr>
       <w:tblGrid>
-        <w:gridCol w:w="3387"/>
-        <w:gridCol w:w="1203"/>
-        <w:gridCol w:w="2042"/>
-        <w:gridCol w:w="1432"/>
-        <w:gridCol w:w="2252"/>
+        <w:gridCol w:w="1692"/>
+        <w:gridCol w:w="1473"/>
+        <w:gridCol w:w="2542"/>
+        <w:gridCol w:w="1765"/>
+        <w:gridCol w:w="2844"/>
       </w:tblGrid>
       <w:tr>
         <w:tc>
@@ -2686,68 +2748,29 @@
                 <w:rFonts w:cstheme="minorHAnsi"/>
                 <w:b/>
                 <w:bCs/>
-                <w:lang w:bidi="ta-IN"/>
-              </w:rPr>
-            </w:pPr>
-            <w:r>
-              <w:rPr>
-                <w:rFonts w:cstheme="minorHAnsi"/>
-                <w:lang w:bidi="ta-IN"/>
-              </w:rPr>
-              <w:t>{#flatOfferProductValidation}{#PriceConditionClassification}</w:t>
-            </w:r>
-            <w:r>
-              <w:rPr>
-                <w:rFonts w:cstheme="minorHAnsi"/>
-                <w:lang w:bidi="ta-IN"/>
+                <w:lang w:val="it-IT" w:bidi="ta-IN"/>
+              </w:rPr>
+            </w:pPr>
+            <w:r>
+              <w:rPr>
+                <w:rFonts w:cstheme="minorHAnsi"/>
+                <w:lang w:val="it-IT" w:bidi="ta-IN"/>
               </w:rPr>
               <w:t>{#</w:t>
             </w:r>
             <w:r>
               <w:rPr>
-                <w:lang w:bidi="ta-IN"/>
-              </w:rPr>
-              <w:t xml:space="preserve"> </w:t>
-            </w:r>
-            <w:proofErr w:type="spellStart"/>
-            <w:r>
-              <w:rPr>
-                <w:lang w:bidi="ta-IN"/>
-              </w:rPr>
-              <w:t>ConditionType</w:t>
-            </w:r>
-            <w:proofErr w:type="spellEnd"/>
-            <w:r>
-              <w:rPr>
-                <w:lang w:bidi="ta-IN"/>
-              </w:rPr>
-              <w:t>==’</w:t>
-            </w:r>
-            <w:proofErr w:type="spellStart"/>
-            <w:r>
-              <w:t>Descuento</w:t>
-            </w:r>
-            <w:proofErr w:type="spellEnd"/>
-            <w:r>
-              <w:t xml:space="preserve"> </w:t>
-            </w:r>
-            <w:proofErr w:type="spellStart"/>
-            <w:r>
-              <w:t>Comercial</w:t>
-            </w:r>
-            <w:proofErr w:type="spellEnd"/>
-            <w:r>
-              <w:rPr>
-                <w:lang w:bidi="ta-IN"/>
-              </w:rPr>
-              <w:t>’</w:t>
+                <w:rFonts w:cstheme="minorHAnsi"/>
+                <w:lang w:val="it-IT" w:bidi="ta-IN"/>
+              </w:rPr>
+              <w:t>items</w:t>
             </w:r>
             <w:r>
               <w:rPr>
                 <w:rFonts w:cstheme="minorHAnsi"/>
                 <w:b/>
                 <w:bCs/>
-                <w:lang w:bidi="ta-IN"/>
+                <w:lang w:val="it-IT" w:bidi="ta-IN"/>
               </w:rPr>
               <w:t>}</w:t>
             </w:r>
@@ -2756,14 +2779,14 @@
                 <w:rFonts w:cstheme="minorHAnsi"/>
                 <w:b/>
                 <w:bCs/>
-                <w:lang w:bidi="ta-IN"/>
+                <w:lang w:val="it-IT" w:bidi="ta-IN"/>
               </w:rPr>
               <w:t>Código SAP:</w:t>
             </w:r>
             <w:r>
               <w:rPr>
                 <w:rFonts w:cstheme="minorHAnsi"/>
-                <w:lang w:bidi="ta-IN"/>
+                <w:lang w:val="it-IT" w:bidi="ta-IN"/>
               </w:rPr>
               <w:t>{SKU}</w:t>
             </w:r>
@@ -3009,17 +3032,17 @@
                 <w:rFonts w:cstheme="minorHAnsi"/>
                 <w:lang w:bidi="ta-IN"/>
               </w:rPr>
-              <w:t>{/}</w:t>
-            </w:r>
-            <w:r>
-              <w:rPr>
-                <w:rFonts w:cstheme="minorHAnsi"/>
-                <w:lang w:bidi="ta-IN"/>
-              </w:rPr>
-              <w:t>{/}</w:t>
-            </w:r>
-            <w:r>
-              <w:t>{/}</w:t>
+              <w:t>{/</w:t>
+            </w:r>
+            <w:r>
+              <w:rPr>
+                <w:rFonts w:cstheme="minorHAnsi"/>
+                <w:lang w:bidi="ta-IN"/>
+              </w:rPr>
+              <w:t>items</w:t>
+            </w:r>
+            <w:r>
+              <w:t>}</w:t>
             </w:r>
           </w:p>
         </w:tc>
@@ -3107,6 +3130,38 @@
     <w:p>
       <w:pPr>
         <w:spacing w:after="0" w:line="240" w:lineRule="auto"/>
+        <w:jc w:val="both"/>
+        <w:rPr>
+          <w:rFonts w:cstheme="minorHAnsi"/>
+          <w:b/>
+          <w:bCs/>
+          <w:lang w:bidi="ta-IN"/>
+        </w:rPr>
+      </w:pPr>
+      <w:r>
+        <w:rPr>
+          <w:rFonts w:cstheme="minorHAnsi"/>
+          <w:lang w:bidi="ta-IN"/>
+        </w:rPr>
+        <w:t>{/}{#</w:t>
+      </w:r>
+      <w:r>
+        <w:t>Descuento</w:t>
+      </w:r>
+      <w:r>
+        <w:t>Especial</w:t>
+      </w:r>
+      <w:r>
+        <w:rPr>
+          <w:rFonts w:cstheme="minorHAnsi"/>
+          <w:lang w:bidi="ta-IN"/>
+        </w:rPr>
+        <w:t>}</w:t>
+      </w:r>
+    </w:p>
+    <w:p>
+      <w:pPr>
+        <w:spacing w:after="0" w:line="240" w:lineRule="auto"/>
         <w:ind w:left="-425"/>
         <w:jc w:val="both"/>
         <w:rPr>
@@ -3136,11 +3191,11 @@
         <w:tblLook w:val="04A0" w:firstRow="1" w:lastRow="0" w:firstColumn="1" w:lastColumn="0" w:noHBand="0" w:noVBand="1"/>
       </w:tblPr>
       <w:tblGrid>
-        <w:gridCol w:w="4702"/>
-        <w:gridCol w:w="1613"/>
-        <w:gridCol w:w="990"/>
-        <w:gridCol w:w="1936"/>
-        <w:gridCol w:w="1075"/>
+        <w:gridCol w:w="2584"/>
+        <w:gridCol w:w="1939"/>
+        <w:gridCol w:w="1171"/>
+        <w:gridCol w:w="2338"/>
+        <w:gridCol w:w="2284"/>
       </w:tblGrid>
       <w:tr>
         <w:tc>
@@ -3272,42 +3327,14 @@
                 <w:rFonts w:cstheme="minorHAnsi"/>
                 <w:lang w:bidi="ta-IN"/>
               </w:rPr>
-              <w:t>{#flatOfferProductValidation}{#PriceConditionClassification}</w:t>
-            </w:r>
-            <w:r>
-              <w:rPr>
-                <w:rFonts w:cstheme="minorHAnsi"/>
-                <w:lang w:bidi="ta-IN"/>
-              </w:rPr>
               <w:t>{#</w:t>
             </w:r>
             <w:r>
               <w:rPr>
-                <w:lang w:bidi="ta-IN"/>
-              </w:rPr>
-              <w:t xml:space="preserve"> </w:t>
-            </w:r>
-            <w:proofErr w:type="spellStart"/>
-            <w:r>
-              <w:rPr>
-                <w:lang w:bidi="ta-IN"/>
-              </w:rPr>
-              <w:t>ConditionType</w:t>
-            </w:r>
-            <w:proofErr w:type="spellEnd"/>
-            <w:r>
-              <w:rPr>
-                <w:lang w:bidi="ta-IN"/>
-              </w:rPr>
-              <w:t>==’</w:t>
-            </w:r>
-            <w:proofErr w:type="spellStart"/>
-            <w:r>
-              <w:t>Descuento</w:t>
-            </w:r>
-            <w:proofErr w:type="spellEnd"/>
-            <w:r>
-              <w:t xml:space="preserve"> Especial</w:t>
+                <w:rFonts w:cstheme="minorHAnsi"/>
+                <w:lang w:bidi="ta-IN"/>
+              </w:rPr>
+              <w:t>items</w:t>
             </w:r>
             <w:r>
               <w:rPr>
@@ -3316,7 +3343,7 @@
                 <w:bCs/>
                 <w:lang w:bidi="ta-IN"/>
               </w:rPr>
-              <w:t>’}</w:t>
+              <w:t>}</w:t>
             </w:r>
             <w:r>
               <w:rPr>
@@ -3534,17 +3561,21 @@
                 <w:rFonts w:cstheme="minorHAnsi"/>
                 <w:lang w:bidi="ta-IN"/>
               </w:rPr>
-              <w:t>{/}</w:t>
-            </w:r>
-            <w:r>
-              <w:rPr>
-                <w:rFonts w:cstheme="minorHAnsi"/>
-                <w:lang w:bidi="ta-IN"/>
-              </w:rPr>
-              <w:t>{/}</w:t>
-            </w:r>
-            <w:r>
-              <w:t>{/}</w:t>
+              <w:t>{/</w:t>
+            </w:r>
+            <w:r>
+              <w:rPr>
+                <w:rFonts w:cstheme="minorHAnsi"/>
+                <w:lang w:bidi="ta-IN"/>
+              </w:rPr>
+              <w:t>items</w:t>
+            </w:r>
+            <w:r>
+              <w:rPr>
+                <w:rFonts w:cstheme="minorHAnsi"/>
+                <w:lang w:bidi="ta-IN"/>
+              </w:rPr>
+              <w:t>}</w:t>
             </w:r>
           </w:p>
         </w:tc>
@@ -3629,6 +3660,54 @@
         </w:tc>
       </w:tr>
     </w:tbl>
+    <w:p>
+      <w:pPr>
+        <w:spacing w:after="0" w:line="240" w:lineRule="auto"/>
+        <w:jc w:val="both"/>
+        <w:rPr>
+          <w:rFonts w:cstheme="minorHAnsi"/>
+          <w:b/>
+          <w:bCs/>
+          <w:lang w:bidi="ta-IN"/>
+        </w:rPr>
+      </w:pPr>
+      <w:r>
+        <w:rPr>
+          <w:rFonts w:cstheme="minorHAnsi"/>
+          <w:lang w:bidi="ta-IN"/>
+        </w:rPr>
+        <w:t>{/</w:t>
+      </w:r>
+      <w:proofErr w:type="spellStart"/>
+      <w:r>
+        <w:t>Descuento</w:t>
+      </w:r>
+      <w:r>
+        <w:t>Especial</w:t>
+      </w:r>
+      <w:proofErr w:type="spellEnd"/>
+      <w:r>
+        <w:rPr>
+          <w:rFonts w:cstheme="minorHAnsi"/>
+          <w:lang w:bidi="ta-IN"/>
+        </w:rPr>
+        <w:t>}{#</w:t>
+      </w:r>
+      <w:r>
+        <w:rPr>
+          <w:rFonts w:cstheme="minorHAnsi"/>
+          <w:lang w:bidi="ta-IN"/>
+        </w:rPr>
+        <w:t>Rental</w:t>
+      </w:r>
+      <w:r>
+        <w:rPr>
+          <w:rFonts w:cstheme="minorHAnsi"/>
+          <w:lang w:bidi="ta-IN"/>
+        </w:rPr>
+        <w:t>}</w:t>
+      </w:r>
+    </w:p>
     <w:p>
       <w:pPr>
         <w:spacing w:after="0" w:line="240" w:lineRule="auto"/>
@@ -3731,26 +3810,14 @@
                 <w:rFonts w:cstheme="minorHAnsi"/>
                 <w:lang w:bidi="ta-IN"/>
               </w:rPr>
-              <w:t>{#flatOfferProductValidation}{#PriceConditionClassification}</w:t>
-            </w:r>
-            <w:r>
-              <w:rPr>
-                <w:rFonts w:cstheme="minorHAnsi"/>
-                <w:lang w:bidi="ta-IN"/>
-              </w:rPr>
               <w:t>{#</w:t>
             </w:r>
             <w:r>
               <w:rPr>
-                <w:lang w:bidi="ta-IN"/>
-              </w:rPr>
-              <w:t>ConditionType</w:t>
-            </w:r>
-            <w:r>
-              <w:rPr>
-                <w:lang w:bidi="ta-IN"/>
-              </w:rPr>
-              <w:t>==’Rental’</w:t>
+                <w:rFonts w:cstheme="minorHAnsi"/>
+                <w:lang w:bidi="ta-IN"/>
+              </w:rPr>
+              <w:t>items</w:t>
             </w:r>
             <w:r>
               <w:rPr>
@@ -3931,17 +3998,17 @@
                 <w:rFonts w:eastAsia="Times New Roman"/>
                 <w:lang w:eastAsia="en-IN" w:bidi="ta-IN"/>
               </w:rPr>
-              <w:t>{/}</w:t>
+              <w:t>{/</w:t>
             </w:r>
             <w:r>
               <w:rPr>
                 <w:rFonts w:eastAsia="Times New Roman"/>
                 <w:lang w:eastAsia="en-IN" w:bidi="ta-IN"/>
               </w:rPr>
-              <w:t>{/}</w:t>
-            </w:r>
-            <w:r>
-              <w:t>{/}</w:t>
+              <w:t>items</w:t>
+            </w:r>
+            <w:r>
+              <w:t>}</w:t>
             </w:r>
           </w:p>
         </w:tc>
@@ -4033,6 +4100,40 @@
         <w:jc w:val="both"/>
         <w:rPr>
           <w:rFonts w:cstheme="minorHAnsi"/>
+          <w:lang w:val="fr-BE" w:bidi="ta-IN"/>
+        </w:rPr>
+      </w:pPr>
+      <w:r>
+        <w:rPr>
+          <w:rFonts w:cstheme="minorHAnsi"/>
+          <w:lang w:val="fr-BE" w:bidi="ta-IN"/>
+        </w:rPr>
+        <w:t>{/</w:t>
+      </w:r>
+      <w:proofErr w:type="spellStart"/>
+      <w:r>
+        <w:rPr>
+          <w:rFonts w:cstheme="minorHAnsi"/>
+          <w:lang w:val="fr-BE" w:bidi="ta-IN"/>
+        </w:rPr>
+        <w:t>Rental</w:t>
+      </w:r>
+      <w:proofErr w:type="spellEnd"/>
+      <w:r>
+        <w:rPr>
+          <w:rFonts w:cstheme="minorHAnsi"/>
+          <w:lang w:val="fr-BE" w:bidi="ta-IN"/>
+        </w:rPr>
+        <w:t>}</w:t>
+      </w:r>
+    </w:p>
+    <w:p>
+      <w:pPr>
+        <w:spacing w:after="0" w:line="360" w:lineRule="auto"/>
+        <w:ind w:left="-425"/>
+        <w:jc w:val="both"/>
+        <w:rPr>
+          <w:rFonts w:cstheme="minorHAnsi"/>
           <w:b/>
           <w:bCs/>
           <w:lang w:val="fr-BE" w:bidi="ta-IN"/>
@@ -4043,20 +4144,13 @@
           <w:rFonts w:cstheme="minorHAnsi"/>
           <w:lang w:val="fr-BE" w:bidi="ta-IN"/>
         </w:rPr>
-        <w:t>{#flatOfferProductValidation}{#PriceConditionClassification}</w:t>
-      </w:r>
-      <w:r>
-        <w:rPr>
-          <w:rFonts w:cstheme="minorHAnsi"/>
+        <w:t>{#</w:t>
+      </w:r>
+      <w:r>
+        <w:rPr>
           <w:lang w:val="fr-BE" w:bidi="ta-IN"/>
         </w:rPr>
-        <w:t>{#</w:t>
-      </w:r>
-      <w:r>
-        <w:rPr>
-          <w:lang w:val="fr-BE" w:bidi="ta-IN"/>
-        </w:rPr>
-        <w:t>ConditionType== ’Rappel’</w:t>
+        <w:t>Rappel</w:t>
       </w:r>
       <w:r>
         <w:rPr>
@@ -4065,9 +4159,8 @@
           <w:bCs/>
           <w:lang w:val="fr-BE" w:bidi="ta-IN"/>
         </w:rPr>
-        <w:t>}{</w:t>
-      </w:r>
-      <w:proofErr w:type="spellStart"/>
+        <w:t>}</w:t>
+      </w:r>
       <w:r>
         <w:rPr>
           <w:rFonts w:cstheme="minorHAnsi"/>
@@ -4075,9 +4168,15 @@
           <w:bCs/>
           <w:lang w:val="fr-BE" w:bidi="ta-IN"/>
         </w:rPr>
-        <w:t>ConditionType</w:t>
-      </w:r>
-      <w:proofErr w:type="spellEnd"/>
+        <w:t>{#items}</w:t>
+      </w:r>
+      <w:r>
+        <w:rPr>
+          <w:rFonts w:cstheme="minorHAnsi"/>
+          <w:lang w:val="fr-BE" w:bidi="ta-IN"/>
+        </w:rPr>
+        <w:t>{PriceConditionClassification}</w:t>
+      </w:r>
       <w:r>
         <w:rPr>
           <w:rFonts w:cstheme="minorHAnsi"/>
@@ -4085,7 +4184,14 @@
           <w:bCs/>
           <w:lang w:val="fr-BE" w:bidi="ta-IN"/>
         </w:rPr>
-        <w:t>}</w:t>
+        <w:t>{ConditionType}</w:t>
+      </w:r>
+      <w:r>
+        <w:rPr>
+          <w:rFonts w:cstheme="minorHAnsi"/>
+          <w:lang w:val="fr-BE" w:bidi="ta-IN"/>
+        </w:rPr>
+        <w:t>{/PriceConditionClassification}</w:t>
       </w:r>
     </w:p>
     <w:p>
@@ -4095,14 +4201,14 @@
         <w:jc w:val="both"/>
         <w:rPr>
           <w:rFonts w:cstheme="minorHAnsi"/>
-          <w:lang w:bidi="ta-IN"/>
+          <w:lang w:val="fr-BE" w:bidi="ta-IN"/>
         </w:rPr>
       </w:pPr>
       <w:proofErr w:type="spellStart"/>
       <w:r>
         <w:rPr>
           <w:rFonts w:cstheme="minorHAnsi"/>
-          <w:lang w:bidi="ta-IN"/>
+          <w:lang w:val="fr-BE" w:bidi="ta-IN"/>
         </w:rPr>
         <w:t>RoyalDecree</w:t>
       </w:r>
@@ -4110,7 +4216,7 @@
       <w:r>
         <w:rPr>
           <w:rFonts w:cstheme="minorHAnsi"/>
-          <w:lang w:bidi="ta-IN"/>
+          <w:lang w:val="fr-BE" w:bidi="ta-IN"/>
         </w:rPr>
         <w:t>: {</w:t>
       </w:r>
@@ -4118,7 +4224,7 @@
       <w:r>
         <w:rPr>
           <w:rFonts w:cstheme="minorHAnsi"/>
-          <w:lang w:bidi="ta-IN"/>
+          <w:lang w:val="fr-BE" w:bidi="ta-IN"/>
         </w:rPr>
         <w:t>RoyalDecree</w:t>
       </w:r>
@@ -4126,7 +4232,7 @@
       <w:r>
         <w:rPr>
           <w:rFonts w:cstheme="minorHAnsi"/>
-          <w:lang w:bidi="ta-IN"/>
+          <w:lang w:val="fr-BE" w:bidi="ta-IN"/>
         </w:rPr>
         <w:t>}</w:t>
       </w:r>
@@ -4138,13 +4244,13 @@
         <w:jc w:val="both"/>
         <w:rPr>
           <w:rFonts w:cstheme="minorHAnsi"/>
-          <w:lang w:bidi="ta-IN"/>
+          <w:lang w:val="fr-BE" w:bidi="ta-IN"/>
         </w:rPr>
       </w:pPr>
       <w:r>
         <w:rPr>
           <w:rFonts w:cstheme="minorHAnsi"/>
-          <w:lang w:bidi="ta-IN"/>
+          <w:lang w:val="fr-BE" w:bidi="ta-IN"/>
         </w:rPr>
         <w:t>Liquidation: {Liquidation}</w:t>
       </w:r>
@@ -4156,14 +4262,14 @@
         <w:jc w:val="both"/>
         <w:rPr>
           <w:rFonts w:cstheme="minorHAnsi"/>
-          <w:lang w:bidi="ta-IN"/>
+          <w:lang w:val="fr-BE" w:bidi="ta-IN"/>
         </w:rPr>
       </w:pPr>
       <w:proofErr w:type="spellStart"/>
       <w:r>
         <w:rPr>
           <w:rFonts w:cstheme="minorHAnsi"/>
-          <w:lang w:bidi="ta-IN"/>
+          <w:lang w:val="fr-BE" w:bidi="ta-IN"/>
         </w:rPr>
         <w:t>Settlement_ID</w:t>
       </w:r>
@@ -4171,7 +4277,7 @@
       <w:r>
         <w:rPr>
           <w:rFonts w:cstheme="minorHAnsi"/>
-          <w:lang w:bidi="ta-IN"/>
+          <w:lang w:val="fr-BE" w:bidi="ta-IN"/>
         </w:rPr>
         <w:t>: {</w:t>
       </w:r>
@@ -4179,7 +4285,7 @@
       <w:r>
         <w:rPr>
           <w:rFonts w:cstheme="minorHAnsi"/>
-          <w:lang w:bidi="ta-IN"/>
+          <w:lang w:val="fr-BE" w:bidi="ta-IN"/>
         </w:rPr>
         <w:t>Settlement_ID</w:t>
       </w:r>
@@ -4187,23 +4293,44 @@
       <w:r>
         <w:rPr>
           <w:rFonts w:cstheme="minorHAnsi"/>
-          <w:lang w:bidi="ta-IN"/>
+          <w:lang w:val="fr-BE" w:bidi="ta-IN"/>
         </w:rPr>
         <w:t>}{/</w:t>
       </w:r>
       <w:r>
         <w:rPr>
           <w:rFonts w:cstheme="minorHAnsi"/>
-          <w:lang w:bidi="ta-IN"/>
+          <w:lang w:val="fr-BE" w:bidi="ta-IN"/>
+        </w:rPr>
+        <w:t>items</w:t>
+      </w:r>
+      <w:r>
+        <w:rPr>
+          <w:rFonts w:cstheme="minorHAnsi"/>
+          <w:lang w:val="fr-BE" w:bidi="ta-IN"/>
         </w:rPr>
         <w:t>}</w:t>
       </w:r>
       <w:r>
         <w:rPr>
           <w:rFonts w:cstheme="minorHAnsi"/>
-          <w:lang w:bidi="ta-IN"/>
-        </w:rPr>
-        <w:t>{/}{/}</w:t>
+          <w:lang w:val="fr-BE" w:bidi="ta-IN"/>
+        </w:rPr>
+        <w:t>{/</w:t>
+      </w:r>
+      <w:r>
+        <w:rPr>
+          <w:rFonts w:cstheme="minorHAnsi"/>
+          <w:lang w:val="fr-BE" w:bidi="ta-IN"/>
+        </w:rPr>
+        <w:t>Rappel</w:t>
+      </w:r>
+      <w:r>
+        <w:rPr>
+          <w:rFonts w:cstheme="minorHAnsi"/>
+          <w:lang w:val="fr-BE" w:bidi="ta-IN"/>
+        </w:rPr>
+        <w:t>}</w:t>
       </w:r>
     </w:p>
     <w:p>
@@ -4215,105 +4342,59 @@
           <w:rFonts w:cstheme="minorHAnsi"/>
           <w:b/>
           <w:bCs/>
-          <w:lang w:bidi="ta-IN"/>
+          <w:lang w:val="fr-BE" w:bidi="ta-IN"/>
         </w:rPr>
       </w:pPr>
       <w:r>
         <w:rPr>
           <w:rFonts w:cstheme="minorHAnsi"/>
-          <w:lang w:bidi="ta-IN"/>
-        </w:rPr>
-        <w:t>{#flatOfferProductValidation}{#PriceConditionClassification}</w:t>
-      </w:r>
-      <w:r>
-        <w:rPr>
-          <w:rFonts w:cstheme="minorHAnsi"/>
-          <w:lang w:bidi="ta-IN"/>
+          <w:lang w:val="fr-BE" w:bidi="ta-IN"/>
         </w:rPr>
         <w:t>{#</w:t>
       </w:r>
       <w:r>
         <w:rPr>
-          <w:lang w:bidi="ta-IN"/>
-        </w:rPr>
-        <w:t>ConditionType</w:t>
-      </w:r>
-      <w:r>
-        <w:rPr>
-          <w:lang w:bidi="ta-IN"/>
-        </w:rPr>
-        <w:t>==</w:t>
-      </w:r>
-      <w:r>
-        <w:rPr>
-          <w:lang w:bidi="ta-IN"/>
-        </w:rPr>
-        <w:t xml:space="preserve"> </w:t>
-      </w:r>
-      <w:r>
-        <w:rPr>
-          <w:lang w:bidi="ta-IN"/>
-        </w:rPr>
-        <w:t>‘FOC’</w:t>
+          <w:rFonts w:cstheme="minorHAnsi"/>
+          <w:lang w:val="fr-BE" w:bidi="ta-IN"/>
+        </w:rPr>
+        <w:t>FOC</w:t>
+      </w:r>
+      <w:r>
+        <w:rPr>
+          <w:rFonts w:cstheme="minorHAnsi"/>
+          <w:lang w:val="fr-BE" w:bidi="ta-IN"/>
+        </w:rPr>
+        <w:t>}</w:t>
+      </w:r>
+      <w:r>
+        <w:rPr>
+          <w:rFonts w:cstheme="minorHAnsi"/>
+          <w:lang w:val="fr-BE" w:bidi="ta-IN"/>
+        </w:rPr>
+        <w:t>{#items}</w:t>
+      </w:r>
+      <w:r>
+        <w:rPr>
+          <w:rFonts w:cstheme="minorHAnsi"/>
+          <w:lang w:val="fr-BE" w:bidi="ta-IN"/>
+        </w:rPr>
+        <w:t>{PriceConditionClassification}</w:t>
       </w:r>
       <w:r>
         <w:rPr>
           <w:rFonts w:cstheme="minorHAnsi"/>
           <w:b/>
           <w:bCs/>
-          <w:lang w:bidi="ta-IN"/>
-        </w:rPr>
-        <w:t>}{</w:t>
-      </w:r>
-      <w:proofErr w:type="spellStart"/>
-      <w:r>
-        <w:rPr>
-          <w:rFonts w:cstheme="minorHAnsi"/>
-          <w:b/>
-          <w:bCs/>
-          <w:lang w:bidi="ta-IN"/>
-        </w:rPr>
-        <w:t>ConditionType</w:t>
-      </w:r>
-      <w:proofErr w:type="spellEnd"/>
-      <w:r>
-        <w:rPr>
-          <w:rFonts w:cstheme="minorHAnsi"/>
-          <w:b/>
-          <w:bCs/>
-          <w:lang w:bidi="ta-IN"/>
-        </w:rPr>
-        <w:t>}</w:t>
-      </w:r>
-      <w:r>
-        <w:rPr>
-          <w:rFonts w:cstheme="minorHAnsi"/>
-          <w:lang w:bidi="ta-IN"/>
-        </w:rPr>
-        <w:t>{/}</w:t>
-      </w:r>
-      <w:r>
-        <w:rPr>
-          <w:rFonts w:cstheme="minorHAnsi"/>
-          <w:lang w:bidi="ta-IN"/>
-        </w:rPr>
-        <w:t>{/</w:t>
-      </w:r>
-      <w:proofErr w:type="spellStart"/>
-      <w:r>
-        <w:rPr>
-          <w:rFonts w:cstheme="minorHAnsi"/>
-          <w:lang w:bidi="ta-IN"/>
-        </w:rPr>
-        <w:t>PriceConditionClassification</w:t>
-      </w:r>
-      <w:proofErr w:type="spellEnd"/>
-      <w:r>
-        <w:rPr>
-          <w:rFonts w:cstheme="minorHAnsi"/>
-          <w:lang w:bidi="ta-IN"/>
-        </w:rPr>
-        <w:t>}</w:t>
+          <w:lang w:val="fr-BE" w:bidi="ta-IN"/>
+        </w:rPr>
+        <w:t>{ConditionType}</w:t>
+      </w:r>
+      <w:r>
+        <w:rPr>
+          <w:rFonts w:cstheme="minorHAnsi"/>
+          <w:lang w:val="fr-BE" w:bidi="ta-IN"/>
+        </w:rPr>
+        <w:t>{/PriceConditionClassification}</w:t>
       </w:r>
     </w:p>
     <w:tbl>
@@ -4610,7 +4691,7 @@
       <w:tr>
         <w:tc>
           <w:tcPr>
-            <w:tcW w:w="3216" w:type="dxa"/>
+            <w:tcW w:w="2660" w:type="dxa"/>
           </w:tcPr>
           <w:p>
             <w:pPr>
@@ -4649,7 +4730,7 @@
         </w:tc>
         <w:tc>
           <w:tcPr>
-            <w:tcW w:w="1254" w:type="dxa"/>
+            <w:tcW w:w="1061" w:type="dxa"/>
           </w:tcPr>
           <w:p>
             <w:pPr>
@@ -4672,7 +4753,7 @@
         </w:tc>
         <w:tc>
           <w:tcPr>
-            <w:tcW w:w="1512" w:type="dxa"/>
+            <w:tcW w:w="2070" w:type="dxa"/>
           </w:tcPr>
           <w:p>
             <w:pPr>
@@ -4695,7 +4776,7 @@
         </w:tc>
         <w:tc>
           <w:tcPr>
-            <w:tcW w:w="1058" w:type="dxa"/>
+            <w:tcW w:w="1701" w:type="dxa"/>
           </w:tcPr>
           <w:p>
             <w:pPr>
@@ -4718,7 +4799,7 @@
         </w:tc>
         <w:tc>
           <w:tcPr>
-            <w:tcW w:w="2260" w:type="dxa"/>
+            <w:tcW w:w="2824" w:type="dxa"/>
           </w:tcPr>
           <w:p>
             <w:pPr>
@@ -4743,7 +4824,7 @@
       <w:tr>
         <w:tc>
           <w:tcPr>
-            <w:tcW w:w="3216" w:type="dxa"/>
+            <w:tcW w:w="2660" w:type="dxa"/>
           </w:tcPr>
           <w:p>
             <w:pPr>
@@ -4786,7 +4867,7 @@
         </w:tc>
         <w:tc>
           <w:tcPr>
-            <w:tcW w:w="1254" w:type="dxa"/>
+            <w:tcW w:w="1061" w:type="dxa"/>
           </w:tcPr>
           <w:p>
             <w:pPr>
@@ -4830,7 +4911,7 @@
         </w:tc>
         <w:tc>
           <w:tcPr>
-            <w:tcW w:w="1512" w:type="dxa"/>
+            <w:tcW w:w="2070" w:type="dxa"/>
           </w:tcPr>
           <w:p>
             <w:pPr>
@@ -4890,7 +4971,7 @@
         </w:tc>
         <w:tc>
           <w:tcPr>
-            <w:tcW w:w="1058" w:type="dxa"/>
+            <w:tcW w:w="1701" w:type="dxa"/>
           </w:tcPr>
           <w:p>
             <w:pPr>
@@ -4932,7 +5013,7 @@
         </w:tc>
         <w:tc>
           <w:tcPr>
-            <w:tcW w:w="2260" w:type="dxa"/>
+            <w:tcW w:w="2824" w:type="dxa"/>
           </w:tcPr>
           <w:p>
             <w:pPr>
@@ -4967,7 +5048,14 @@
                 <w:rFonts w:cs="Latha"/>
                 <w:lang w:bidi="ta-IN"/>
               </w:rPr>
-              <w:t>}{/}</w:t>
+              <w:t>}</w:t>
+            </w:r>
+            <w:r>
+              <w:rPr>
+                <w:rFonts w:cs="Latha"/>
+                <w:lang w:bidi="ta-IN"/>
+              </w:rPr>
+              <w:t>{/}</w:t>
             </w:r>
           </w:p>
         </w:tc>
@@ -4985,6 +5073,34 @@
       <w:r>
         <w:rPr>
           <w:rFonts w:cstheme="minorHAnsi"/>
+          <w:lang w:val="en-US" w:bidi="ta-IN"/>
+        </w:rPr>
+        <w:t>{/</w:t>
+      </w:r>
+      <w:r>
+        <w:rPr>
+          <w:rFonts w:cstheme="minorHAnsi"/>
+          <w:lang w:val="en-US" w:bidi="ta-IN"/>
+        </w:rPr>
+        <w:t>items</w:t>
+      </w:r>
+      <w:r>
+        <w:rPr>
+          <w:rFonts w:cstheme="minorHAnsi"/>
+          <w:lang w:val="en-US" w:bidi="ta-IN"/>
+        </w:rPr>
+        <w:t>}</w:t>
+      </w:r>
+      <w:r>
+        <w:rPr>
+          <w:rFonts w:cstheme="minorHAnsi"/>
+          <w:lang w:val="en-US" w:bidi="ta-IN"/>
+        </w:rPr>
+        <w:t>{/FOC}</w:t>
+      </w:r>
+      <w:r>
+        <w:rPr>
+          <w:rFonts w:cstheme="minorHAnsi"/>
           <w:lang w:val="nl-BE" w:bidi="ta-IN"/>
         </w:rPr>
         <w:t>{/</w:t>
@@ -4993,9 +5109,9 @@
       <w:r>
         <w:rPr>
           <w:rFonts w:cstheme="minorHAnsi"/>
-          <w:lang w:bidi="ta-IN"/>
-        </w:rPr>
-        <w:t>flatOfferProductValidation</w:t>
+          <w:lang w:val="en-US" w:bidi="ta-IN"/>
+        </w:rPr>
+        <w:t>groupedOfferProductValidation</w:t>
       </w:r>
       <w:proofErr w:type="spellEnd"/>
       <w:r>

</xml_diff>